<commit_message>
Convert ER diagram from table to graphical format in Word document
Co-authored-by: ltingfeng72 <220255270+ltingfeng72@users.noreply.github.com>
</commit_message>
<xml_diff>
--- a/图书管理系统设计文档.docx
+++ b/图书管理系统设计文档.docx
@@ -903,24 +903,638 @@
     </w:p>
     <w:p>
       <w:r>
+        <w:t>本系统的实体关系模型如下所示，采用标准的ER图表示法：</w:t>
+      </w:r>
+    </w:p>
+    <w:p/>
+    <w:p>
+      <w:r>
+        <w:t>【实体-关系图形化表示】</w:t>
+      </w:r>
+    </w:p>
+    <w:p/>
+    <w:p>
+      <w:r>
         <w:rPr>
-          <w:rFonts w:ascii="Microsoft YaHei" w:hAnsi="Microsoft YaHei" w:eastAsia="Microsoft YaHei"/>
-          <w:sz w:val="22"/>
+          <w:rFonts w:ascii="Courier New" w:hAnsi="Courier New"/>
+          <w:sz w:val="18"/>
         </w:rPr>
-        <w:t>本系统的实体关系模型如下所示，采用标准的ER图表示法：</w:t>
+        <w:t>┌─────────────────┐              ┌─────────────────┐</w:t>
+      </w:r>
+    </w:p>
+    <w:p>
+      <w:r>
+        <w:rPr>
+          <w:rFonts w:ascii="Courier New" w:hAnsi="Courier New"/>
+          <w:sz w:val="18"/>
+        </w:rPr>
+        <w:t>│     Users       │              │    Readers      │</w:t>
+      </w:r>
+    </w:p>
+    <w:p>
+      <w:r>
+        <w:rPr>
+          <w:rFonts w:ascii="Courier New" w:hAnsi="Courier New"/>
+          <w:sz w:val="18"/>
+        </w:rPr>
+        <w:t>│   (用户表)      │              │   (读者表)      │</w:t>
+      </w:r>
+    </w:p>
+    <w:p>
+      <w:r>
+        <w:rPr>
+          <w:rFonts w:ascii="Courier New" w:hAnsi="Courier New"/>
+          <w:sz w:val="18"/>
+        </w:rPr>
+        <w:t>├─────────────────┤              ├─────────────────┤</w:t>
+      </w:r>
+    </w:p>
+    <w:p>
+      <w:r>
+        <w:rPr>
+          <w:rFonts w:ascii="Courier New" w:hAnsi="Courier New"/>
+          <w:sz w:val="18"/>
+        </w:rPr>
+        <w:t>│ 属性：          │   1 : 0..1   │ 属性：          │</w:t>
+      </w:r>
+    </w:p>
+    <w:p>
+      <w:r>
+        <w:rPr>
+          <w:rFonts w:ascii="Courier New" w:hAnsi="Courier New"/>
+          <w:sz w:val="18"/>
+        </w:rPr>
+        <w:t>│ ◯ id (PK)       │──────────────│ ◯ id (PK)       │</w:t>
+      </w:r>
+    </w:p>
+    <w:p>
+      <w:r>
+        <w:rPr>
+          <w:rFonts w:ascii="Courier New" w:hAnsi="Courier New"/>
+          <w:sz w:val="18"/>
+        </w:rPr>
+        <w:t>│ ◯ username      │   账户关联   │ ◯ name          │</w:t>
+      </w:r>
+    </w:p>
+    <w:p>
+      <w:r>
+        <w:rPr>
+          <w:rFonts w:ascii="Courier New" w:hAnsi="Courier New"/>
+          <w:sz w:val="18"/>
+        </w:rPr>
+        <w:t>│ ◯ password      │              │ ◯ user_id (FK)  │</w:t>
+      </w:r>
+    </w:p>
+    <w:p>
+      <w:r>
+        <w:rPr>
+          <w:rFonts w:ascii="Courier New" w:hAnsi="Courier New"/>
+          <w:sz w:val="18"/>
+        </w:rPr>
+        <w:t>│ ◯ role          │              └─────────────────┘</w:t>
+      </w:r>
+    </w:p>
+    <w:p>
+      <w:r>
+        <w:rPr>
+          <w:rFonts w:ascii="Courier New" w:hAnsi="Courier New"/>
+          <w:sz w:val="18"/>
+        </w:rPr>
+        <w:t>└─────────────────┘                       │</w:t>
+      </w:r>
+    </w:p>
+    <w:p>
+      <w:r>
+        <w:rPr>
+          <w:rFonts w:ascii="Courier New" w:hAnsi="Courier New"/>
+          <w:sz w:val="18"/>
+        </w:rPr>
+        <w:t xml:space="preserve">                                          │</w:t>
+      </w:r>
+    </w:p>
+    <w:p>
+      <w:r>
+        <w:rPr>
+          <w:rFonts w:ascii="Courier New" w:hAnsi="Courier New"/>
+          <w:sz w:val="18"/>
+        </w:rPr>
+        <w:t xml:space="preserve">                                          │ 1 : N</w:t>
+      </w:r>
+    </w:p>
+    <w:p>
+      <w:r>
+        <w:rPr>
+          <w:rFonts w:ascii="Courier New" w:hAnsi="Courier New"/>
+          <w:sz w:val="18"/>
+        </w:rPr>
+        <w:t xml:space="preserve">                                          │ 借阅记录</w:t>
+      </w:r>
+    </w:p>
+    <w:p>
+      <w:r>
+        <w:rPr>
+          <w:rFonts w:ascii="Courier New" w:hAnsi="Courier New"/>
+          <w:sz w:val="18"/>
+        </w:rPr>
+        <w:t xml:space="preserve">                                          │</w:t>
+      </w:r>
+    </w:p>
+    <w:p>
+      <w:r>
+        <w:rPr>
+          <w:rFonts w:ascii="Courier New" w:hAnsi="Courier New"/>
+          <w:sz w:val="18"/>
+        </w:rPr>
+        <w:t xml:space="preserve">                                          ▼</w:t>
+      </w:r>
+    </w:p>
+    <w:p>
+      <w:r>
+        <w:rPr>
+          <w:rFonts w:ascii="Courier New" w:hAnsi="Courier New"/>
+          <w:sz w:val="18"/>
+        </w:rPr>
+        <w:t xml:space="preserve">                                ┌─────────────────┐</w:t>
+      </w:r>
+    </w:p>
+    <w:p>
+      <w:r>
+        <w:rPr>
+          <w:rFonts w:ascii="Courier New" w:hAnsi="Courier New"/>
+          <w:sz w:val="18"/>
+        </w:rPr>
+        <w:t xml:space="preserve">                                │    Borrows      │</w:t>
+      </w:r>
+    </w:p>
+    <w:p>
+      <w:r>
+        <w:rPr>
+          <w:rFonts w:ascii="Courier New" w:hAnsi="Courier New"/>
+          <w:sz w:val="18"/>
+        </w:rPr>
+        <w:t xml:space="preserve">                                │   (借阅表)      │</w:t>
+      </w:r>
+    </w:p>
+    <w:p>
+      <w:r>
+        <w:rPr>
+          <w:rFonts w:ascii="Courier New" w:hAnsi="Courier New"/>
+          <w:sz w:val="18"/>
+        </w:rPr>
+        <w:t xml:space="preserve">                                ├─────────────────┤</w:t>
+      </w:r>
+    </w:p>
+    <w:p>
+      <w:r>
+        <w:rPr>
+          <w:rFonts w:ascii="Courier New" w:hAnsi="Courier New"/>
+          <w:sz w:val="18"/>
+        </w:rPr>
+        <w:t xml:space="preserve">                                │ 属性：          │</w:t>
+      </w:r>
+    </w:p>
+    <w:p>
+      <w:r>
+        <w:rPr>
+          <w:rFonts w:ascii="Courier New" w:hAnsi="Courier New"/>
+          <w:sz w:val="18"/>
+        </w:rPr>
+        <w:t xml:space="preserve">                                │ ◯ id (PK)       │</w:t>
+      </w:r>
+    </w:p>
+    <w:p>
+      <w:r>
+        <w:rPr>
+          <w:rFonts w:ascii="Courier New" w:hAnsi="Courier New"/>
+          <w:sz w:val="18"/>
+        </w:rPr>
+        <w:t xml:space="preserve">                                │ ◯ book_id (FK)  │</w:t>
+      </w:r>
+    </w:p>
+    <w:p>
+      <w:r>
+        <w:rPr>
+          <w:rFonts w:ascii="Courier New" w:hAnsi="Courier New"/>
+          <w:sz w:val="18"/>
+        </w:rPr>
+        <w:t xml:space="preserve">                                │ ◯ reader_id(FK) │</w:t>
+      </w:r>
+    </w:p>
+    <w:p>
+      <w:r>
+        <w:rPr>
+          <w:rFonts w:ascii="Courier New" w:hAnsi="Courier New"/>
+          <w:sz w:val="18"/>
+        </w:rPr>
+        <w:t xml:space="preserve">                                │ ◯ borrowed_at   │</w:t>
+      </w:r>
+    </w:p>
+    <w:p>
+      <w:r>
+        <w:rPr>
+          <w:rFonts w:ascii="Courier New" w:hAnsi="Courier New"/>
+          <w:sz w:val="18"/>
+        </w:rPr>
+        <w:t xml:space="preserve">                                │ ◯ returned_at   │</w:t>
+      </w:r>
+    </w:p>
+    <w:p>
+      <w:r>
+        <w:rPr>
+          <w:rFonts w:ascii="Courier New" w:hAnsi="Courier New"/>
+          <w:sz w:val="18"/>
+        </w:rPr>
+        <w:t xml:space="preserve">                                └─────────────────┘</w:t>
+      </w:r>
+    </w:p>
+    <w:p>
+      <w:r>
+        <w:rPr>
+          <w:rFonts w:ascii="Courier New" w:hAnsi="Courier New"/>
+          <w:sz w:val="18"/>
+        </w:rPr>
+        <w:t xml:space="preserve">                                          ▲</w:t>
+      </w:r>
+    </w:p>
+    <w:p>
+      <w:r>
+        <w:rPr>
+          <w:rFonts w:ascii="Courier New" w:hAnsi="Courier New"/>
+          <w:sz w:val="18"/>
+        </w:rPr>
+        <w:t xml:space="preserve">                                          │</w:t>
+      </w:r>
+    </w:p>
+    <w:p>
+      <w:r>
+        <w:rPr>
+          <w:rFonts w:ascii="Courier New" w:hAnsi="Courier New"/>
+          <w:sz w:val="18"/>
+        </w:rPr>
+        <w:t xml:space="preserve">                                          │ 1 : N</w:t>
+      </w:r>
+    </w:p>
+    <w:p>
+      <w:r>
+        <w:rPr>
+          <w:rFonts w:ascii="Courier New" w:hAnsi="Courier New"/>
+          <w:sz w:val="18"/>
+        </w:rPr>
+        <w:t xml:space="preserve">                                          │ 被借图书</w:t>
+      </w:r>
+    </w:p>
+    <w:p>
+      <w:r>
+        <w:rPr>
+          <w:rFonts w:ascii="Courier New" w:hAnsi="Courier New"/>
+          <w:sz w:val="18"/>
+        </w:rPr>
+        <w:t xml:space="preserve">                                          │</w:t>
+      </w:r>
+    </w:p>
+    <w:p>
+      <w:r>
+        <w:rPr>
+          <w:rFonts w:ascii="Courier New" w:hAnsi="Courier New"/>
+          <w:sz w:val="18"/>
+        </w:rPr>
+        <w:t>┌─────────────────┐              ┌─────────────────┐</w:t>
+      </w:r>
+    </w:p>
+    <w:p>
+      <w:r>
+        <w:rPr>
+          <w:rFonts w:ascii="Courier New" w:hAnsi="Courier New"/>
+          <w:sz w:val="18"/>
+        </w:rPr>
+        <w:t>│    Shelves      │              │     Books       │</w:t>
+      </w:r>
+    </w:p>
+    <w:p>
+      <w:r>
+        <w:rPr>
+          <w:rFonts w:ascii="Courier New" w:hAnsi="Courier New"/>
+          <w:sz w:val="18"/>
+        </w:rPr>
+        <w:t>│   (书架表)      │              │   (图书表)      │</w:t>
+      </w:r>
+    </w:p>
+    <w:p>
+      <w:r>
+        <w:rPr>
+          <w:rFonts w:ascii="Courier New" w:hAnsi="Courier New"/>
+          <w:sz w:val="18"/>
+        </w:rPr>
+        <w:t>├─────────────────┤   1 : N      ├─────────────────┤</w:t>
+      </w:r>
+    </w:p>
+    <w:p>
+      <w:r>
+        <w:rPr>
+          <w:rFonts w:ascii="Courier New" w:hAnsi="Courier New"/>
+          <w:sz w:val="18"/>
+        </w:rPr>
+        <w:t>│ 属性：          │──────────────│ 属性：          │</w:t>
+      </w:r>
+    </w:p>
+    <w:p>
+      <w:r>
+        <w:rPr>
+          <w:rFonts w:ascii="Courier New" w:hAnsi="Courier New"/>
+          <w:sz w:val="18"/>
+        </w:rPr>
+        <w:t>│ ◯ id (PK)       │   存放位置   │ ◯ id (PK)       │</w:t>
+      </w:r>
+    </w:p>
+    <w:p>
+      <w:r>
+        <w:rPr>
+          <w:rFonts w:ascii="Courier New" w:hAnsi="Courier New"/>
+          <w:sz w:val="18"/>
+        </w:rPr>
+        <w:t>│ ◯ code          │              │ ◯ isbn          │</w:t>
+      </w:r>
+    </w:p>
+    <w:p>
+      <w:r>
+        <w:rPr>
+          <w:rFonts w:ascii="Courier New" w:hAnsi="Courier New"/>
+          <w:sz w:val="18"/>
+        </w:rPr>
+        <w:t>│ ◯ location      │              │ ◯ title         │</w:t>
+      </w:r>
+    </w:p>
+    <w:p>
+      <w:r>
+        <w:rPr>
+          <w:rFonts w:ascii="Courier New" w:hAnsi="Courier New"/>
+          <w:sz w:val="18"/>
+        </w:rPr>
+        <w:t>└─────────────────┘              │ ◯ author        │</w:t>
+      </w:r>
+    </w:p>
+    <w:p>
+      <w:r>
+        <w:rPr>
+          <w:rFonts w:ascii="Courier New" w:hAnsi="Courier New"/>
+          <w:sz w:val="18"/>
+        </w:rPr>
+        <w:t xml:space="preserve">                                 │ ◯ shelf_id (FK) │</w:t>
+      </w:r>
+    </w:p>
+    <w:p>
+      <w:r>
+        <w:rPr>
+          <w:rFonts w:ascii="Courier New" w:hAnsi="Courier New"/>
+          <w:sz w:val="18"/>
+        </w:rPr>
+        <w:t xml:space="preserve">                                 │ ◯ total_copies  │</w:t>
+      </w:r>
+    </w:p>
+    <w:p>
+      <w:r>
+        <w:rPr>
+          <w:rFonts w:ascii="Courier New" w:hAnsi="Courier New"/>
+          <w:sz w:val="18"/>
+        </w:rPr>
+        <w:t xml:space="preserve">                                 │ ◯ available_    │</w:t>
+      </w:r>
+    </w:p>
+    <w:p>
+      <w:r>
+        <w:rPr>
+          <w:rFonts w:ascii="Courier New" w:hAnsi="Courier New"/>
+          <w:sz w:val="18"/>
+        </w:rPr>
+        <w:t xml:space="preserve">                                 │   copies        │</w:t>
+      </w:r>
+    </w:p>
+    <w:p>
+      <w:r>
+        <w:rPr>
+          <w:rFonts w:ascii="Courier New" w:hAnsi="Courier New"/>
+          <w:sz w:val="18"/>
+        </w:rPr>
+        <w:t xml:space="preserve">                                 └─────────────────┘</w:t>
       </w:r>
     </w:p>
     <w:p/>
     <w:p>
       <w:r>
+        <w:t>【图例说明】</w:t>
+      </w:r>
+    </w:p>
+    <w:p>
+      <w:r>
         <w:rPr>
-          <w:rFonts w:ascii="Microsoft YaHei" w:hAnsi="Microsoft YaHei" w:eastAsia="Microsoft YaHei"/>
-          <w:b/>
-          <w:sz w:val="22"/>
+          <w:rFonts w:ascii="Courier New" w:hAnsi="Courier New"/>
+          <w:sz w:val="18"/>
         </w:rPr>
+        <w:t>┌─────────┐  矩形：表示实体 (Entities)</w:t>
+      </w:r>
+    </w:p>
+    <w:p>
+      <w:r>
+        <w:rPr>
+          <w:rFonts w:ascii="Courier New" w:hAnsi="Courier New"/>
+          <w:sz w:val="18"/>
+        </w:rPr>
+        <w:t>│ Entity  │</w:t>
+      </w:r>
+    </w:p>
+    <w:p>
+      <w:r>
+        <w:rPr>
+          <w:rFonts w:ascii="Courier New" w:hAnsi="Courier New"/>
+          <w:sz w:val="18"/>
+        </w:rPr>
+        <w:t>└─────────┘</w:t>
+      </w:r>
+    </w:p>
+    <w:p/>
+    <w:p>
+      <w:r>
+        <w:rPr>
+          <w:rFonts w:ascii="Courier New" w:hAnsi="Courier New"/>
+          <w:sz w:val="18"/>
+        </w:rPr>
+        <w:t>◯ Attribute  椭圆形符号：表示属性 (Attributes)</w:t>
+      </w:r>
+    </w:p>
+    <w:p/>
+    <w:p>
+      <w:r>
+        <w:t xml:space="preserve">    1 : N</w:t>
+      </w:r>
+    </w:p>
+    <w:p>
+      <w:r>
+        <w:rPr>
+          <w:rFonts w:ascii="Courier New" w:hAnsi="Courier New"/>
+          <w:sz w:val="18"/>
+        </w:rPr>
+        <w:t>────────────  无向边+标注：表示关系及其类型 (Relationships)</w:t>
+      </w:r>
+    </w:p>
+    <w:p/>
+    <w:p>
+      <w:r>
+        <w:t>【关系类型说明】</w:t>
+      </w:r>
+    </w:p>
+    <w:p>
+      <w:r>
+        <w:t>• 1 : 0..1  表示一对零或一的关系</w:t>
+      </w:r>
+    </w:p>
+    <w:p>
+      <w:r>
+        <w:t>• 1 : N     表示一对多的关系</w:t>
+      </w:r>
+    </w:p>
+    <w:p/>
+    <w:p>
+      <w:r>
+        <w:t>【实体说明】</w:t>
+      </w:r>
+    </w:p>
+    <w:p/>
+    <w:p>
+      <w:r>
         <w:t>【实体1：Users（用户表）】</w:t>
       </w:r>
     </w:p>
+    <w:p/>
+    <w:p>
+      <w:r>
+        <w:t>【实体2：Readers（读者表）】</w:t>
+      </w:r>
+    </w:p>
+    <w:p/>
+    <w:p>
+      <w:r>
+        <w:t>【实体3：Books（图书表）】</w:t>
+      </w:r>
+    </w:p>
+    <w:p/>
+    <w:p>
+      <w:r>
+        <w:t>【实体4：Shelves（书架表）】</w:t>
+      </w:r>
+    </w:p>
+    <w:p/>
+    <w:p>
+      <w:r>
+        <w:t>【实体5：Borrows（借阅表）】</w:t>
+      </w:r>
+    </w:p>
+    <w:p/>
+    <w:p>
+      <w:r>
+        <w:t>【实体关系说明】</w:t>
+      </w:r>
+    </w:p>
+    <w:p/>
+    <w:p>
+      <w:r>
+        <w:rPr>
+          <w:rFonts w:ascii="Courier New" w:hAnsi="Courier New"/>
+          <w:sz w:val="18"/>
+        </w:rPr>
+        <w:t>1. Users ◇───── Readers (账户关联: 1 : 0..1)</w:t>
+      </w:r>
+    </w:p>
+    <w:p>
+      <w:r>
+        <w:t xml:space="preserve">   - 一个用户账户可以对应零个或一个读者记录</w:t>
+      </w:r>
+    </w:p>
+    <w:p>
+      <w:r>
+        <w:t xml:space="preserve">   - 一个读者可以没有登录账户，也可以关联一个用户账户</w:t>
+      </w:r>
+    </w:p>
+    <w:p>
+      <w:r>
+        <w:t xml:space="preserve">   - 使用外键 user_id 实现关联</w:t>
+      </w:r>
+    </w:p>
+    <w:p/>
+    <w:p>
+      <w:r>
+        <w:rPr>
+          <w:rFonts w:ascii="Courier New" w:hAnsi="Courier New"/>
+          <w:sz w:val="18"/>
+        </w:rPr>
+        <w:t>2. Readers ◇───── Borrows (借阅记录: 1 : N)</w:t>
+      </w:r>
+    </w:p>
+    <w:p>
+      <w:r>
+        <w:t xml:space="preserve">   - 一个读者可以有多条借阅记录</w:t>
+      </w:r>
+    </w:p>
+    <w:p>
+      <w:r>
+        <w:t xml:space="preserve">   - 每条借阅记录属于一个读者</w:t>
+      </w:r>
+    </w:p>
+    <w:p>
+      <w:r>
+        <w:t xml:space="preserve">   - 使用外键 reader_id 实现关联</w:t>
+      </w:r>
+    </w:p>
+    <w:p/>
+    <w:p>
+      <w:r>
+        <w:rPr>
+          <w:rFonts w:ascii="Courier New" w:hAnsi="Courier New"/>
+          <w:sz w:val="18"/>
+        </w:rPr>
+        <w:t>3. Books ◇───── Borrows (被借图书: 1 : N)</w:t>
+      </w:r>
+    </w:p>
+    <w:p>
+      <w:r>
+        <w:t xml:space="preserve">   - 一本图书可以被借阅多次</w:t>
+      </w:r>
+    </w:p>
+    <w:p>
+      <w:r>
+        <w:t xml:space="preserve">   - 每条借阅记录对应一本图书</w:t>
+      </w:r>
+    </w:p>
+    <w:p>
+      <w:r>
+        <w:t xml:space="preserve">   - 使用外键 book_id 实现关联</w:t>
+      </w:r>
+    </w:p>
+    <w:p/>
+    <w:p>
+      <w:r>
+        <w:rPr>
+          <w:rFonts w:ascii="Courier New" w:hAnsi="Courier New"/>
+          <w:sz w:val="18"/>
+        </w:rPr>
+        <w:t>4. Shelves ◇───── Books (存放位置: 1 : N)</w:t>
+      </w:r>
+    </w:p>
+    <w:p>
+      <w:r>
+        <w:t xml:space="preserve">   - 一个书架可以存放多本图书</w:t>
+      </w:r>
+    </w:p>
+    <w:p>
+      <w:r>
+        <w:t xml:space="preserve">   - 每本图书存放在一个书架上</w:t>
+      </w:r>
+    </w:p>
+    <w:p>
+      <w:r>
+        <w:t xml:space="preserve">   - 使用外键 shelf_id 实现关联</w:t>
+      </w:r>
+    </w:p>
+    <w:p/>
     <w:tbl>
       <w:tblPr>
         <w:tblStyle w:val="LightGrid-Accent1"/>
@@ -1093,17 +1707,6 @@
         </w:tc>
       </w:tr>
     </w:tbl>
-    <w:p/>
-    <w:p>
-      <w:r>
-        <w:rPr>
-          <w:rFonts w:ascii="Microsoft YaHei" w:hAnsi="Microsoft YaHei" w:eastAsia="Microsoft YaHei"/>
-          <w:b/>
-          <w:sz w:val="22"/>
-        </w:rPr>
-        <w:t>【实体2：Readers（读者表）】</w:t>
-      </w:r>
-    </w:p>
     <w:tbl>
       <w:tblPr>
         <w:tblStyle w:val="LightGrid-Accent1"/>
@@ -1244,17 +1847,6 @@
         </w:tc>
       </w:tr>
     </w:tbl>
-    <w:p/>
-    <w:p>
-      <w:r>
-        <w:rPr>
-          <w:rFonts w:ascii="Microsoft YaHei" w:hAnsi="Microsoft YaHei" w:eastAsia="Microsoft YaHei"/>
-          <w:b/>
-          <w:sz w:val="22"/>
-        </w:rPr>
-        <w:t>【实体3：Books（图书表）】</w:t>
-      </w:r>
-    </w:p>
     <w:tbl>
       <w:tblPr>
         <w:tblStyle w:val="LightGrid-Accent1"/>
@@ -1523,17 +2115,6 @@
         </w:tc>
       </w:tr>
     </w:tbl>
-    <w:p/>
-    <w:p>
-      <w:r>
-        <w:rPr>
-          <w:rFonts w:ascii="Microsoft YaHei" w:hAnsi="Microsoft YaHei" w:eastAsia="Microsoft YaHei"/>
-          <w:b/>
-          <w:sz w:val="22"/>
-        </w:rPr>
-        <w:t>【实体4：Shelves（书架表）】</w:t>
-      </w:r>
-    </w:p>
     <w:tbl>
       <w:tblPr>
         <w:tblStyle w:val="LightGrid-Accent1"/>
@@ -1674,17 +2255,6 @@
         </w:tc>
       </w:tr>
     </w:tbl>
-    <w:p/>
-    <w:p>
-      <w:r>
-        <w:rPr>
-          <w:rFonts w:ascii="Microsoft YaHei" w:hAnsi="Microsoft YaHei" w:eastAsia="Microsoft YaHei"/>
-          <w:b/>
-          <w:sz w:val="22"/>
-        </w:rPr>
-        <w:t>【实体5：Borrows（借阅表）】</w:t>
-      </w:r>
-    </w:p>
     <w:tbl>
       <w:tblPr>
         <w:tblStyle w:val="LightGrid-Accent1"/>
@@ -1889,242 +2459,6 @@
         </w:tc>
       </w:tr>
     </w:tbl>
-    <w:p/>
-    <w:p>
-      <w:r>
-        <w:rPr>
-          <w:rFonts w:ascii="Microsoft YaHei" w:hAnsi="Microsoft YaHei" w:eastAsia="Microsoft YaHei"/>
-          <w:b/>
-          <w:sz w:val="22"/>
-        </w:rPr>
-        <w:t>【实体关系说明】</w:t>
-      </w:r>
-    </w:p>
-    <w:p/>
-    <w:tbl>
-      <w:tblPr>
-        <w:tblStyle w:val="LightGrid-Accent1"/>
-        <w:tblW w:type="auto" w:w="0"/>
-        <w:tblLook w:firstColumn="1" w:firstRow="1" w:lastColumn="0" w:lastRow="0" w:noHBand="0" w:noVBand="1" w:val="04A0"/>
-      </w:tblPr>
-      <w:tblGrid>
-        <w:gridCol w:w="2160"/>
-        <w:gridCol w:w="2160"/>
-        <w:gridCol w:w="2160"/>
-        <w:gridCol w:w="2160"/>
-      </w:tblGrid>
-      <w:tr>
-        <w:tc>
-          <w:tcPr>
-            <w:tcW w:type="dxa" w:w="2160"/>
-          </w:tcPr>
-          <w:p>
-            <w:r>
-              <w:t>关系名称</w:t>
-            </w:r>
-          </w:p>
-        </w:tc>
-        <w:tc>
-          <w:tcPr>
-            <w:tcW w:type="dxa" w:w="2160"/>
-          </w:tcPr>
-          <w:p>
-            <w:r>
-              <w:t>实体A</w:t>
-            </w:r>
-          </w:p>
-        </w:tc>
-        <w:tc>
-          <w:tcPr>
-            <w:tcW w:type="dxa" w:w="2160"/>
-          </w:tcPr>
-          <w:p>
-            <w:r>
-              <w:t>关系类型</w:t>
-            </w:r>
-          </w:p>
-        </w:tc>
-        <w:tc>
-          <w:tcPr>
-            <w:tcW w:type="dxa" w:w="2160"/>
-          </w:tcPr>
-          <w:p>
-            <w:r>
-              <w:t>实体B</w:t>
-            </w:r>
-          </w:p>
-        </w:tc>
-      </w:tr>
-      <w:tr>
-        <w:tc>
-          <w:tcPr>
-            <w:tcW w:type="dxa" w:w="2160"/>
-          </w:tcPr>
-          <w:p>
-            <w:r>
-              <w:t>账户关联</w:t>
-            </w:r>
-          </w:p>
-        </w:tc>
-        <w:tc>
-          <w:tcPr>
-            <w:tcW w:type="dxa" w:w="2160"/>
-          </w:tcPr>
-          <w:p>
-            <w:r>
-              <w:t>Users</w:t>
-            </w:r>
-          </w:p>
-        </w:tc>
-        <w:tc>
-          <w:tcPr>
-            <w:tcW w:type="dxa" w:w="2160"/>
-          </w:tcPr>
-          <w:p>
-            <w:r>
-              <w:t>1 : 0..1</w:t>
-            </w:r>
-          </w:p>
-        </w:tc>
-        <w:tc>
-          <w:tcPr>
-            <w:tcW w:type="dxa" w:w="2160"/>
-          </w:tcPr>
-          <w:p>
-            <w:r>
-              <w:t>Readers</w:t>
-            </w:r>
-          </w:p>
-        </w:tc>
-      </w:tr>
-      <w:tr>
-        <w:tc>
-          <w:tcPr>
-            <w:tcW w:type="dxa" w:w="2160"/>
-          </w:tcPr>
-          <w:p>
-            <w:r>
-              <w:t>借阅记录</w:t>
-            </w:r>
-          </w:p>
-        </w:tc>
-        <w:tc>
-          <w:tcPr>
-            <w:tcW w:type="dxa" w:w="2160"/>
-          </w:tcPr>
-          <w:p>
-            <w:r>
-              <w:t>Readers</w:t>
-            </w:r>
-          </w:p>
-        </w:tc>
-        <w:tc>
-          <w:tcPr>
-            <w:tcW w:type="dxa" w:w="2160"/>
-          </w:tcPr>
-          <w:p>
-            <w:r>
-              <w:t>1 : N</w:t>
-            </w:r>
-          </w:p>
-        </w:tc>
-        <w:tc>
-          <w:tcPr>
-            <w:tcW w:type="dxa" w:w="2160"/>
-          </w:tcPr>
-          <w:p>
-            <w:r>
-              <w:t>Borrows</w:t>
-            </w:r>
-          </w:p>
-        </w:tc>
-      </w:tr>
-      <w:tr>
-        <w:tc>
-          <w:tcPr>
-            <w:tcW w:type="dxa" w:w="2160"/>
-          </w:tcPr>
-          <w:p>
-            <w:r>
-              <w:t>被借图书</w:t>
-            </w:r>
-          </w:p>
-        </w:tc>
-        <w:tc>
-          <w:tcPr>
-            <w:tcW w:type="dxa" w:w="2160"/>
-          </w:tcPr>
-          <w:p>
-            <w:r>
-              <w:t>Books</w:t>
-            </w:r>
-          </w:p>
-        </w:tc>
-        <w:tc>
-          <w:tcPr>
-            <w:tcW w:type="dxa" w:w="2160"/>
-          </w:tcPr>
-          <w:p>
-            <w:r>
-              <w:t>1 : N</w:t>
-            </w:r>
-          </w:p>
-        </w:tc>
-        <w:tc>
-          <w:tcPr>
-            <w:tcW w:type="dxa" w:w="2160"/>
-          </w:tcPr>
-          <w:p>
-            <w:r>
-              <w:t>Borrows</w:t>
-            </w:r>
-          </w:p>
-        </w:tc>
-      </w:tr>
-      <w:tr>
-        <w:tc>
-          <w:tcPr>
-            <w:tcW w:type="dxa" w:w="2160"/>
-          </w:tcPr>
-          <w:p>
-            <w:r>
-              <w:t>存放位置</w:t>
-            </w:r>
-          </w:p>
-        </w:tc>
-        <w:tc>
-          <w:tcPr>
-            <w:tcW w:type="dxa" w:w="2160"/>
-          </w:tcPr>
-          <w:p>
-            <w:r>
-              <w:t>Shelves</w:t>
-            </w:r>
-          </w:p>
-        </w:tc>
-        <w:tc>
-          <w:tcPr>
-            <w:tcW w:type="dxa" w:w="2160"/>
-          </w:tcPr>
-          <w:p>
-            <w:r>
-              <w:t>1 : N</w:t>
-            </w:r>
-          </w:p>
-        </w:tc>
-        <w:tc>
-          <w:tcPr>
-            <w:tcW w:type="dxa" w:w="2160"/>
-          </w:tcPr>
-          <w:p>
-            <w:r>
-              <w:t>Books</w:t>
-            </w:r>
-          </w:p>
-        </w:tc>
-      </w:tr>
-    </w:tbl>
-    <w:p/>
     <w:p>
       <w:r>
         <w:rPr>

</xml_diff>